<commit_message>
Adicion en Informe, Adicion de Diagrama de tareas y conexiones, Ajuste de los K del PID, Adicion de modulo SD en KICAD
</commit_message>
<xml_diff>
--- a/Datos de tabulacion/Manual de Usuario/MANUAL USUARIO EGA.docx
+++ b/Datos de tabulacion/Manual de Usuario/MANUAL USUARIO EGA.docx
@@ -1,24 +1,27 @@
 
 <file path=word/document.xml><?xml version="1.0" encoding="utf-8"?>
-<w:document xmlns:wpc="http://schemas.microsoft.com/office/word/2010/wordprocessingCanvas" xmlns:cx="http://schemas.microsoft.com/office/drawing/2014/chartex" xmlns:cx1="http://schemas.microsoft.com/office/drawing/2015/9/8/chartex" xmlns:cx2="http://schemas.microsoft.com/office/drawing/2015/10/21/chartex" xmlns:cx3="http://schemas.microsoft.com/office/drawing/2016/5/9/chartex" xmlns:cx4="http://schemas.microsoft.com/office/drawing/2016/5/10/chartex" xmlns:cx5="http://schemas.microsoft.com/office/drawing/2016/5/11/chartex" xmlns:cx6="http://schemas.microsoft.com/office/drawing/2016/5/12/chartex" xmlns:cx7="http://schemas.microsoft.com/office/drawing/2016/5/13/chartex" xmlns:cx8="http://schemas.microsoft.com/office/drawing/2016/5/14/chartex" xmlns:mc="http://schemas.openxmlformats.org/markup-compatibility/2006" xmlns:aink="http://schemas.microsoft.com/office/drawing/2016/ink" xmlns:am3d="http://schemas.microsoft.com/office/drawing/2017/model3d" xmlns:o="urn:schemas-microsoft-com:office:office" xmlns:oel="http://schemas.microsoft.com/office/2019/extlst" xmlns:r="http://schemas.openxmlformats.org/officeDocument/2006/relationships" xmlns:m="http://schemas.openxmlformats.org/officeDocument/2006/math" xmlns:v="urn:schemas-microsoft-com:vml" xmlns:wp14="http://schemas.microsoft.com/office/word/2010/wordprocessingDrawing" xmlns:wp="http://schemas.openxmlformats.org/drawingml/2006/wordprocessingDrawing" xmlns:w10="urn:schemas-microsoft-com:office:word" xmlns:w="http://schemas.openxmlformats.org/wordprocessingml/2006/main" xmlns:w14="http://schemas.microsoft.com/office/word/2010/wordml" xmlns:w15="http://schemas.microsoft.com/office/word/2012/wordml" xmlns:w16cex="http://schemas.microsoft.com/office/word/2018/wordml/cex" xmlns:w16cid="http://schemas.microsoft.com/office/word/2016/wordml/cid" xmlns:w16="http://schemas.microsoft.com/office/word/2018/wordml" xmlns:w16du="http://schemas.microsoft.com/office/word/2023/wordml/word16du" xmlns:w16sdtdh="http://schemas.microsoft.com/office/word/2020/wordml/sdtdatahash" xmlns:w16sdtfl="http://schemas.microsoft.com/office/word/2024/wordml/sdtformatlock" xmlns:w16se="http://schemas.microsoft.com/office/word/2015/wordml/symex" xmlns:wpg="http://schemas.microsoft.com/office/word/2010/wordprocessingGroup" xmlns:wpi="http://schemas.microsoft.com/office/word/2010/wordprocessingInk" xmlns:wne="http://schemas.microsoft.com/office/word/2006/wordml" xmlns:wps="http://schemas.microsoft.com/office/word/2010/wordprocessingShape" mc:Ignorable="w14 w15 w16se w16cid w16 w16cex w16sdtdh w16sdtfl w16du wp14">
+<w:document xmlns:wpc="http://schemas.microsoft.com/office/word/2010/wordprocessingCanvas" xmlns:cx="http://schemas.microsoft.com/office/drawing/2014/chartex" xmlns:mc="http://schemas.openxmlformats.org/markup-compatibility/2006" xmlns:o="urn:schemas-microsoft-com:office:office" xmlns:r="http://schemas.openxmlformats.org/officeDocument/2006/relationships" xmlns:m="http://schemas.openxmlformats.org/officeDocument/2006/math" xmlns:v="urn:schemas-microsoft-com:vml" xmlns:wp14="http://schemas.microsoft.com/office/word/2010/wordprocessingDrawing" xmlns:wp="http://schemas.openxmlformats.org/drawingml/2006/wordprocessingDrawing" xmlns:w10="urn:schemas-microsoft-com:office:word" xmlns:w="http://schemas.openxmlformats.org/wordprocessingml/2006/main" xmlns:w14="http://schemas.microsoft.com/office/word/2010/wordml" xmlns:w15="http://schemas.microsoft.com/office/word/2012/wordml" xmlns:w16se="http://schemas.microsoft.com/office/word/2015/wordml/symex" xmlns:wpg="http://schemas.microsoft.com/office/word/2010/wordprocessingGroup" xmlns:wpi="http://schemas.microsoft.com/office/word/2010/wordprocessingInk" xmlns:wne="http://schemas.microsoft.com/office/word/2006/wordml" xmlns:wps="http://schemas.microsoft.com/office/word/2010/wordprocessingShape" mc:Ignorable="w14 w15 w16se wp14">
   <w:body>
     <w:p>
       <w:pPr>
         <w:jc w:val="center"/>
+        <w:rPr>
+          <w:sz w:val="44"/>
+          <w:szCs w:val="44"/>
+          <w:u w:val="single"/>
+          <w:lang w:val="es-ES_tradnl"/>
+        </w:rPr>
+      </w:pPr>
+      <w:r>
         <w:rPr>
           <w:sz w:val="44"/>
           <w:szCs w:val="44"/>
           <w:lang w:val="es-ES_tradnl"/>
         </w:rPr>
-      </w:pPr>
-      <w:r>
-        <w:rPr>
-          <w:sz w:val="44"/>
-          <w:szCs w:val="44"/>
-          <w:lang w:val="es-ES_tradnl"/>
-        </w:rPr>
         <w:t>UTN FRA</w:t>
       </w:r>
+      <w:bookmarkStart w:id="0" w:name="_GoBack"/>
+      <w:bookmarkEnd w:id="0"/>
     </w:p>
     <w:p>
       <w:pPr>
@@ -139,12 +142,13 @@
       </w:pPr>
       <w:r>
         <w:rPr>
-          <w:lang w:val="es-ES_tradnl"/>
+          <w:noProof/>
+          <w:lang w:val="es-AR" w:eastAsia="es-AR"/>
         </w:rPr>
         <w:drawing>
-          <wp:inline distT="0" distB="0" distL="0" distR="0" wp14:anchorId="2F5C2FC0" wp14:editId="47416CB1">
-            <wp:extent cx="4959534" cy="6672057"/>
-            <wp:effectExtent l="0" t="0" r="6350" b="0"/>
+          <wp:inline distT="0" distB="0" distL="0" distR="0" wp14:anchorId="2F5C2FC0" wp14:editId="69417A30">
+            <wp:extent cx="5349240" cy="7196328"/>
+            <wp:effectExtent l="0" t="0" r="3810" b="5080"/>
             <wp:docPr id="1507911086" name="Picture 1"/>
             <wp:cNvGraphicFramePr>
               <a:graphicFrameLocks xmlns:a="http://schemas.openxmlformats.org/drawingml/2006/main" noChangeAspect="1"/>
@@ -165,7 +169,7 @@
                   <pic:spPr>
                     <a:xfrm>
                       <a:off x="0" y="0"/>
-                      <a:ext cx="4980491" cy="6700250"/>
+                      <a:ext cx="5377393" cy="7234202"/>
                     </a:xfrm>
                     <a:prstGeom prst="rect">
                       <a:avLst/>
@@ -178,9 +182,33 @@
         </w:drawing>
       </w:r>
     </w:p>
+    <w:p>
+      <w:pPr>
+        <w:jc w:val="center"/>
+        <w:rPr>
+          <w:lang w:val="es-ES_tradnl"/>
+        </w:rPr>
+      </w:pPr>
+    </w:p>
+    <w:p>
+      <w:pPr>
+        <w:jc w:val="center"/>
+        <w:rPr>
+          <w:lang w:val="es-ES_tradnl"/>
+        </w:rPr>
+      </w:pPr>
+    </w:p>
+    <w:p>
+      <w:pPr>
+        <w:jc w:val="center"/>
+        <w:rPr>
+          <w:lang w:val="es-ES_tradnl"/>
+        </w:rPr>
+      </w:pPr>
+    </w:p>
     <w:tbl>
       <w:tblPr>
-        <w:tblStyle w:val="TableGrid"/>
+        <w:tblStyle w:val="Tablaconcuadrcula"/>
         <w:tblW w:w="0" w:type="auto"/>
         <w:tblLook w:val="04A0" w:firstRow="1" w:lastRow="0" w:firstColumn="1" w:lastColumn="0" w:noHBand="0" w:noVBand="1"/>
       </w:tblPr>
@@ -294,7 +322,6 @@
               <w:rPr>
                 <w:lang w:val="es-ES_tradnl"/>
               </w:rPr>
-              <w:lastRenderedPageBreak/>
               <w:t>2</w:t>
             </w:r>
           </w:p>
@@ -333,21 +360,7 @@
               <w:rPr>
                 <w:lang w:val="es-ES_tradnl"/>
               </w:rPr>
-              <w:t xml:space="preserve">Almacena el TIMESTAMP, el SETPOINT, y los </w:t>
-            </w:r>
-            <w:proofErr w:type="gramStart"/>
-            <w:r>
-              <w:rPr>
-                <w:lang w:val="es-ES_tradnl"/>
-              </w:rPr>
-              <w:t>UMBRALES  a</w:t>
-            </w:r>
-            <w:proofErr w:type="gramEnd"/>
-            <w:r>
-              <w:rPr>
-                <w:lang w:val="es-ES_tradnl"/>
-              </w:rPr>
-              <w:t xml:space="preserve"> modo de </w:t>
+              <w:t xml:space="preserve">Almacena el TIMESTAMP, el SETPOINT, y los UMBRALES  a modo de </w:t>
             </w:r>
             <w:proofErr w:type="spellStart"/>
             <w:r>
@@ -498,7 +511,7 @@
           </w:p>
           <w:p>
             <w:pPr>
-              <w:pStyle w:val="ListParagraph"/>
+              <w:pStyle w:val="Prrafodelista"/>
               <w:numPr>
                 <w:ilvl w:val="0"/>
                 <w:numId w:val="1"/>
@@ -531,7 +544,7 @@
           </w:p>
           <w:p>
             <w:pPr>
-              <w:pStyle w:val="ListParagraph"/>
+              <w:pStyle w:val="Prrafodelista"/>
               <w:numPr>
                 <w:ilvl w:val="0"/>
                 <w:numId w:val="1"/>
@@ -556,7 +569,7 @@
           </w:p>
           <w:p>
             <w:pPr>
-              <w:pStyle w:val="ListParagraph"/>
+              <w:pStyle w:val="Prrafodelista"/>
               <w:numPr>
                 <w:ilvl w:val="0"/>
                 <w:numId w:val="1"/>
@@ -680,12 +693,26 @@
         <w:rPr>
           <w:lang w:val="es-ES"/>
         </w:rPr>
+        <w:br w:type="page"/>
+      </w:r>
+    </w:p>
+    <w:p>
+      <w:pPr>
+        <w:rPr>
+          <w:lang w:val="es-ES"/>
+        </w:rPr>
+      </w:pPr>
+      <w:r>
+        <w:rPr>
+          <w:lang w:val="es-ES"/>
+        </w:rPr>
+        <w:lastRenderedPageBreak/>
         <w:t>PROCESO DE CONFIGURACIÓN</w:t>
       </w:r>
     </w:p>
     <w:tbl>
       <w:tblPr>
-        <w:tblStyle w:val="TableGrid"/>
+        <w:tblStyle w:val="Tablaconcuadrcula"/>
         <w:tblW w:w="0" w:type="auto"/>
         <w:tblLook w:val="04A0" w:firstRow="1" w:lastRow="0" w:firstColumn="1" w:lastColumn="0" w:noHBand="0" w:noVBand="1"/>
       </w:tblPr>
@@ -755,26 +782,18 @@
                 <w:lang w:val="es-ES"/>
               </w:rPr>
             </w:pPr>
-          </w:p>
-          <w:p>
-            <w:pPr>
-              <w:rPr>
-                <w:lang w:val="es-ES"/>
-              </w:rPr>
-            </w:pPr>
             <w:r>
               <w:rPr>
                 <w:lang w:val="es-ES"/>
               </w:rPr>
               <w:t>Valores admisibles de altura (0 – 33 cm) – el 0 es la base del tubo</w:t>
             </w:r>
-          </w:p>
-          <w:p>
-            <w:pPr>
-              <w:rPr>
-                <w:lang w:val="es-ES"/>
-              </w:rPr>
-            </w:pPr>
+            <w:r>
+              <w:rPr>
+                <w:lang w:val="es-ES"/>
+              </w:rPr>
+              <w:t>.</w:t>
+            </w:r>
           </w:p>
           <w:p>
             <w:pPr>
@@ -787,6 +806,12 @@
                 <w:lang w:val="es-ES"/>
               </w:rPr>
               <w:t>Adicionalmente, la memoria SD empezará a registrar los eventos cada 100 milisegundos</w:t>
+            </w:r>
+            <w:r>
+              <w:rPr>
+                <w:lang w:val="es-ES"/>
+              </w:rPr>
+              <w:t>.</w:t>
             </w:r>
           </w:p>
         </w:tc>
@@ -1018,7 +1043,7 @@
     </w:p>
     <w:tbl>
       <w:tblPr>
-        <w:tblStyle w:val="TableGrid"/>
+        <w:tblStyle w:val="Tablaconcuadrcula"/>
         <w:tblW w:w="0" w:type="auto"/>
         <w:tblLook w:val="04A0" w:firstRow="1" w:lastRow="0" w:firstColumn="1" w:lastColumn="0" w:noHBand="0" w:noVBand="1"/>
       </w:tblPr>
@@ -1039,7 +1064,8 @@
             </w:pPr>
             <w:r>
               <w:rPr>
-                <w:lang w:val="es-ES"/>
+                <w:noProof/>
+                <w:lang w:val="es-AR" w:eastAsia="es-AR"/>
               </w:rPr>
               <w:lastRenderedPageBreak/>
               <w:drawing>
@@ -1092,7 +1118,8 @@
             </w:pPr>
             <w:r>
               <w:rPr>
-                <w:lang w:val="es-ES"/>
+                <w:noProof/>
+                <w:lang w:val="es-AR" w:eastAsia="es-AR"/>
               </w:rPr>
               <w:drawing>
                 <wp:inline distT="0" distB="0" distL="0" distR="0" wp14:anchorId="264DDC8A" wp14:editId="679C2EC3">
@@ -1162,7 +1189,8 @@
       </w:pPr>
       <w:r>
         <w:rPr>
-          <w:lang w:val="es-ES"/>
+          <w:noProof/>
+          <w:lang w:val="es-AR" w:eastAsia="es-AR"/>
         </w:rPr>
         <w:lastRenderedPageBreak/>
         <w:drawing>
@@ -1292,7 +1320,7 @@
 </file>
 
 <file path=word/numbering.xml><?xml version="1.0" encoding="utf-8"?>
-<w:numbering xmlns:wpc="http://schemas.microsoft.com/office/word/2010/wordprocessingCanvas" xmlns:cx="http://schemas.microsoft.com/office/drawing/2014/chartex" xmlns:cx1="http://schemas.microsoft.com/office/drawing/2015/9/8/chartex" xmlns:cx2="http://schemas.microsoft.com/office/drawing/2015/10/21/chartex" xmlns:cx3="http://schemas.microsoft.com/office/drawing/2016/5/9/chartex" xmlns:cx4="http://schemas.microsoft.com/office/drawing/2016/5/10/chartex" xmlns:cx5="http://schemas.microsoft.com/office/drawing/2016/5/11/chartex" xmlns:cx6="http://schemas.microsoft.com/office/drawing/2016/5/12/chartex" xmlns:cx7="http://schemas.microsoft.com/office/drawing/2016/5/13/chartex" xmlns:cx8="http://schemas.microsoft.com/office/drawing/2016/5/14/chartex" xmlns:mc="http://schemas.openxmlformats.org/markup-compatibility/2006" xmlns:aink="http://schemas.microsoft.com/office/drawing/2016/ink" xmlns:am3d="http://schemas.microsoft.com/office/drawing/2017/model3d" xmlns:o="urn:schemas-microsoft-com:office:office" xmlns:oel="http://schemas.microsoft.com/office/2019/extlst" xmlns:r="http://schemas.openxmlformats.org/officeDocument/2006/relationships" xmlns:m="http://schemas.openxmlformats.org/officeDocument/2006/math" xmlns:v="urn:schemas-microsoft-com:vml" xmlns:wp14="http://schemas.microsoft.com/office/word/2010/wordprocessingDrawing" xmlns:wp="http://schemas.openxmlformats.org/drawingml/2006/wordprocessingDrawing" xmlns:w10="urn:schemas-microsoft-com:office:word" xmlns:w="http://schemas.openxmlformats.org/wordprocessingml/2006/main" xmlns:w14="http://schemas.microsoft.com/office/word/2010/wordml" xmlns:w15="http://schemas.microsoft.com/office/word/2012/wordml" xmlns:w16cex="http://schemas.microsoft.com/office/word/2018/wordml/cex" xmlns:w16cid="http://schemas.microsoft.com/office/word/2016/wordml/cid" xmlns:w16="http://schemas.microsoft.com/office/word/2018/wordml" xmlns:w16du="http://schemas.microsoft.com/office/word/2023/wordml/word16du" xmlns:w16sdtdh="http://schemas.microsoft.com/office/word/2020/wordml/sdtdatahash" xmlns:w16sdtfl="http://schemas.microsoft.com/office/word/2024/wordml/sdtformatlock" xmlns:w16se="http://schemas.microsoft.com/office/word/2015/wordml/symex" xmlns:wpg="http://schemas.microsoft.com/office/word/2010/wordprocessingGroup" xmlns:wpi="http://schemas.microsoft.com/office/word/2010/wordprocessingInk" xmlns:wne="http://schemas.microsoft.com/office/word/2006/wordml" xmlns:wps="http://schemas.microsoft.com/office/word/2010/wordprocessingShape" mc:Ignorable="w14 w15 w16se w16cid w16 w16cex w16sdtdh w16sdtfl w16du wp14">
+<w:numbering xmlns:wpc="http://schemas.microsoft.com/office/word/2010/wordprocessingCanvas" xmlns:cx="http://schemas.microsoft.com/office/drawing/2014/chartex" xmlns:mc="http://schemas.openxmlformats.org/markup-compatibility/2006" xmlns:o="urn:schemas-microsoft-com:office:office" xmlns:r="http://schemas.openxmlformats.org/officeDocument/2006/relationships" xmlns:m="http://schemas.openxmlformats.org/officeDocument/2006/math" xmlns:v="urn:schemas-microsoft-com:vml" xmlns:wp14="http://schemas.microsoft.com/office/word/2010/wordprocessingDrawing" xmlns:wp="http://schemas.openxmlformats.org/drawingml/2006/wordprocessingDrawing" xmlns:w10="urn:schemas-microsoft-com:office:word" xmlns:w="http://schemas.openxmlformats.org/wordprocessingml/2006/main" xmlns:w14="http://schemas.microsoft.com/office/word/2010/wordml" xmlns:w15="http://schemas.microsoft.com/office/word/2012/wordml" xmlns:w16se="http://schemas.microsoft.com/office/word/2015/wordml/symex" xmlns:wpg="http://schemas.microsoft.com/office/word/2010/wordprocessingGroup" xmlns:wpi="http://schemas.microsoft.com/office/word/2010/wordprocessingInk" xmlns:wne="http://schemas.microsoft.com/office/word/2006/wordml" xmlns:wps="http://schemas.microsoft.com/office/word/2010/wordprocessingShape" mc:Ignorable="w14 w15 w16se wp14">
   <w:abstractNum w:abstractNumId="0" w15:restartNumberingAfterBreak="0">
     <w:nsid w:val="220B2865"/>
     <w:multiLevelType w:val="hybridMultilevel"/>
@@ -1405,14 +1433,14 @@
       </w:rPr>
     </w:lvl>
   </w:abstractNum>
-  <w:num w:numId="1" w16cid:durableId="757989919">
+  <w:num w:numId="1">
     <w:abstractNumId w:val="0"/>
   </w:num>
 </w:numbering>
 </file>
 
 <file path=word/styles.xml><?xml version="1.0" encoding="utf-8"?>
-<w:styles xmlns:mc="http://schemas.openxmlformats.org/markup-compatibility/2006" xmlns:r="http://schemas.openxmlformats.org/officeDocument/2006/relationships" xmlns:w="http://schemas.openxmlformats.org/wordprocessingml/2006/main" xmlns:w14="http://schemas.microsoft.com/office/word/2010/wordml" xmlns:w15="http://schemas.microsoft.com/office/word/2012/wordml" xmlns:w16cex="http://schemas.microsoft.com/office/word/2018/wordml/cex" xmlns:w16cid="http://schemas.microsoft.com/office/word/2016/wordml/cid" xmlns:w16="http://schemas.microsoft.com/office/word/2018/wordml" xmlns:w16du="http://schemas.microsoft.com/office/word/2023/wordml/word16du" xmlns:w16sdtdh="http://schemas.microsoft.com/office/word/2020/wordml/sdtdatahash" xmlns:w16sdtfl="http://schemas.microsoft.com/office/word/2024/wordml/sdtformatlock" xmlns:w16se="http://schemas.microsoft.com/office/word/2015/wordml/symex" mc:Ignorable="w14 w15 w16se w16cid w16 w16cex w16sdtdh w16sdtfl w16du">
+<w:styles xmlns:mc="http://schemas.openxmlformats.org/markup-compatibility/2006" xmlns:r="http://schemas.openxmlformats.org/officeDocument/2006/relationships" xmlns:w="http://schemas.openxmlformats.org/wordprocessingml/2006/main" xmlns:w14="http://schemas.microsoft.com/office/word/2010/wordml" xmlns:w15="http://schemas.microsoft.com/office/word/2012/wordml" xmlns:w16se="http://schemas.microsoft.com/office/word/2015/wordml/symex" mc:Ignorable="w14 w15 w16se">
   <w:docDefaults>
     <w:rPrDefault>
       <w:rPr>
@@ -1420,7 +1448,7 @@
         <w:kern w:val="2"/>
         <w:sz w:val="24"/>
         <w:szCs w:val="24"/>
-        <w:lang w:val="en-AR" w:eastAsia="en-US" w:bidi="ar-SA"/>
+        <w:lang w:eastAsia="en-US" w:bidi="ar-SA"/>
         <w14:ligatures w14:val="standardContextual"/>
       </w:rPr>
     </w:rPrDefault>
@@ -1430,7 +1458,7 @@
       </w:pPr>
     </w:pPrDefault>
   </w:docDefaults>
-  <w:latentStyles w:defLockedState="0" w:defUIPriority="99" w:defSemiHidden="0" w:defUnhideWhenUsed="0" w:defQFormat="0" w:count="376">
+  <w:latentStyles w:defLockedState="0" w:defUIPriority="99" w:defSemiHidden="0" w:defUnhideWhenUsed="0" w:defQFormat="0" w:count="371">
     <w:lsdException w:name="Normal" w:uiPriority="0" w:qFormat="1"/>
     <w:lsdException w:name="heading 1" w:uiPriority="9" w:qFormat="1"/>
     <w:lsdException w:name="heading 2" w:semiHidden="1" w:uiPriority="9" w:unhideWhenUsed="1" w:qFormat="1"/>
@@ -1802,21 +1830,16 @@
     <w:lsdException w:name="List Table 5 Dark Accent 6" w:uiPriority="50"/>
     <w:lsdException w:name="List Table 6 Colorful Accent 6" w:uiPriority="51"/>
     <w:lsdException w:name="List Table 7 Colorful Accent 6" w:uiPriority="52"/>
-    <w:lsdException w:name="Mention" w:semiHidden="1" w:unhideWhenUsed="1"/>
-    <w:lsdException w:name="Smart Hyperlink" w:semiHidden="1" w:unhideWhenUsed="1"/>
-    <w:lsdException w:name="Hashtag" w:semiHidden="1" w:unhideWhenUsed="1"/>
-    <w:lsdException w:name="Unresolved Mention" w:semiHidden="1" w:unhideWhenUsed="1"/>
-    <w:lsdException w:name="Smart Link" w:semiHidden="1" w:unhideWhenUsed="1"/>
   </w:latentStyles>
   <w:style w:type="paragraph" w:default="1" w:styleId="Normal">
     <w:name w:val="Normal"/>
     <w:qFormat/>
   </w:style>
-  <w:style w:type="paragraph" w:styleId="Heading1">
+  <w:style w:type="paragraph" w:styleId="Ttulo1">
     <w:name w:val="heading 1"/>
     <w:basedOn w:val="Normal"/>
     <w:next w:val="Normal"/>
-    <w:link w:val="Heading1Char"/>
+    <w:link w:val="Ttulo1Car"/>
     <w:uiPriority w:val="9"/>
     <w:qFormat/>
     <w:rsid w:val="00282BA7"/>
@@ -1833,11 +1856,11 @@
       <w:szCs w:val="40"/>
     </w:rPr>
   </w:style>
-  <w:style w:type="paragraph" w:styleId="Heading2">
+  <w:style w:type="paragraph" w:styleId="Ttulo2">
     <w:name w:val="heading 2"/>
     <w:basedOn w:val="Normal"/>
     <w:next w:val="Normal"/>
-    <w:link w:val="Heading2Char"/>
+    <w:link w:val="Ttulo2Car"/>
     <w:uiPriority w:val="9"/>
     <w:semiHidden/>
     <w:unhideWhenUsed/>
@@ -1856,11 +1879,11 @@
       <w:szCs w:val="32"/>
     </w:rPr>
   </w:style>
-  <w:style w:type="paragraph" w:styleId="Heading3">
+  <w:style w:type="paragraph" w:styleId="Ttulo3">
     <w:name w:val="heading 3"/>
     <w:basedOn w:val="Normal"/>
     <w:next w:val="Normal"/>
-    <w:link w:val="Heading3Char"/>
+    <w:link w:val="Ttulo3Car"/>
     <w:uiPriority w:val="9"/>
     <w:semiHidden/>
     <w:unhideWhenUsed/>
@@ -1879,11 +1902,11 @@
       <w:szCs w:val="28"/>
     </w:rPr>
   </w:style>
-  <w:style w:type="paragraph" w:styleId="Heading4">
+  <w:style w:type="paragraph" w:styleId="Ttulo4">
     <w:name w:val="heading 4"/>
     <w:basedOn w:val="Normal"/>
     <w:next w:val="Normal"/>
-    <w:link w:val="Heading4Char"/>
+    <w:link w:val="Ttulo4Car"/>
     <w:uiPriority w:val="9"/>
     <w:semiHidden/>
     <w:unhideWhenUsed/>
@@ -1902,11 +1925,11 @@
       <w:color w:val="2F5496" w:themeColor="accent1" w:themeShade="BF"/>
     </w:rPr>
   </w:style>
-  <w:style w:type="paragraph" w:styleId="Heading5">
+  <w:style w:type="paragraph" w:styleId="Ttulo5">
     <w:name w:val="heading 5"/>
     <w:basedOn w:val="Normal"/>
     <w:next w:val="Normal"/>
-    <w:link w:val="Heading5Char"/>
+    <w:link w:val="Ttulo5Car"/>
     <w:uiPriority w:val="9"/>
     <w:semiHidden/>
     <w:unhideWhenUsed/>
@@ -1923,11 +1946,11 @@
       <w:color w:val="2F5496" w:themeColor="accent1" w:themeShade="BF"/>
     </w:rPr>
   </w:style>
-  <w:style w:type="paragraph" w:styleId="Heading6">
+  <w:style w:type="paragraph" w:styleId="Ttulo6">
     <w:name w:val="heading 6"/>
     <w:basedOn w:val="Normal"/>
     <w:next w:val="Normal"/>
-    <w:link w:val="Heading6Char"/>
+    <w:link w:val="Ttulo6Car"/>
     <w:uiPriority w:val="9"/>
     <w:semiHidden/>
     <w:unhideWhenUsed/>
@@ -1946,11 +1969,11 @@
       <w:color w:val="595959" w:themeColor="text1" w:themeTint="A6"/>
     </w:rPr>
   </w:style>
-  <w:style w:type="paragraph" w:styleId="Heading7">
+  <w:style w:type="paragraph" w:styleId="Ttulo7">
     <w:name w:val="heading 7"/>
     <w:basedOn w:val="Normal"/>
     <w:next w:val="Normal"/>
-    <w:link w:val="Heading7Char"/>
+    <w:link w:val="Ttulo7Car"/>
     <w:uiPriority w:val="9"/>
     <w:semiHidden/>
     <w:unhideWhenUsed/>
@@ -1967,11 +1990,11 @@
       <w:color w:val="595959" w:themeColor="text1" w:themeTint="A6"/>
     </w:rPr>
   </w:style>
-  <w:style w:type="paragraph" w:styleId="Heading8">
+  <w:style w:type="paragraph" w:styleId="Ttulo8">
     <w:name w:val="heading 8"/>
     <w:basedOn w:val="Normal"/>
     <w:next w:val="Normal"/>
-    <w:link w:val="Heading8Char"/>
+    <w:link w:val="Ttulo8Car"/>
     <w:uiPriority w:val="9"/>
     <w:semiHidden/>
     <w:unhideWhenUsed/>
@@ -1990,11 +2013,11 @@
       <w:color w:val="272727" w:themeColor="text1" w:themeTint="D8"/>
     </w:rPr>
   </w:style>
-  <w:style w:type="paragraph" w:styleId="Heading9">
+  <w:style w:type="paragraph" w:styleId="Ttulo9">
     <w:name w:val="heading 9"/>
     <w:basedOn w:val="Normal"/>
     <w:next w:val="Normal"/>
-    <w:link w:val="Heading9Char"/>
+    <w:link w:val="Ttulo9Car"/>
     <w:uiPriority w:val="9"/>
     <w:semiHidden/>
     <w:unhideWhenUsed/>
@@ -2011,13 +2034,13 @@
       <w:color w:val="272727" w:themeColor="text1" w:themeTint="D8"/>
     </w:rPr>
   </w:style>
-  <w:style w:type="character" w:default="1" w:styleId="DefaultParagraphFont">
+  <w:style w:type="character" w:default="1" w:styleId="Fuentedeprrafopredeter">
     <w:name w:val="Default Paragraph Font"/>
     <w:uiPriority w:val="1"/>
     <w:semiHidden/>
     <w:unhideWhenUsed/>
   </w:style>
-  <w:style w:type="table" w:default="1" w:styleId="TableNormal">
+  <w:style w:type="table" w:default="1" w:styleId="Tablanormal">
     <w:name w:val="Normal Table"/>
     <w:uiPriority w:val="99"/>
     <w:semiHidden/>
@@ -2032,16 +2055,16 @@
       </w:tblCellMar>
     </w:tblPr>
   </w:style>
-  <w:style w:type="numbering" w:default="1" w:styleId="NoList">
+  <w:style w:type="numbering" w:default="1" w:styleId="Sinlista">
     <w:name w:val="No List"/>
     <w:uiPriority w:val="99"/>
     <w:semiHidden/>
     <w:unhideWhenUsed/>
   </w:style>
-  <w:style w:type="character" w:customStyle="1" w:styleId="Heading1Char">
-    <w:name w:val="Heading 1 Char"/>
-    <w:basedOn w:val="DefaultParagraphFont"/>
-    <w:link w:val="Heading1"/>
+  <w:style w:type="character" w:customStyle="1" w:styleId="Ttulo1Car">
+    <w:name w:val="Título 1 Car"/>
+    <w:basedOn w:val="Fuentedeprrafopredeter"/>
+    <w:link w:val="Ttulo1"/>
     <w:uiPriority w:val="9"/>
     <w:rsid w:val="00282BA7"/>
     <w:rPr>
@@ -2051,10 +2074,10 @@
       <w:szCs w:val="40"/>
     </w:rPr>
   </w:style>
-  <w:style w:type="character" w:customStyle="1" w:styleId="Heading2Char">
-    <w:name w:val="Heading 2 Char"/>
-    <w:basedOn w:val="DefaultParagraphFont"/>
-    <w:link w:val="Heading2"/>
+  <w:style w:type="character" w:customStyle="1" w:styleId="Ttulo2Car">
+    <w:name w:val="Título 2 Car"/>
+    <w:basedOn w:val="Fuentedeprrafopredeter"/>
+    <w:link w:val="Ttulo2"/>
     <w:uiPriority w:val="9"/>
     <w:semiHidden/>
     <w:rsid w:val="00282BA7"/>
@@ -2065,10 +2088,10 @@
       <w:szCs w:val="32"/>
     </w:rPr>
   </w:style>
-  <w:style w:type="character" w:customStyle="1" w:styleId="Heading3Char">
-    <w:name w:val="Heading 3 Char"/>
-    <w:basedOn w:val="DefaultParagraphFont"/>
-    <w:link w:val="Heading3"/>
+  <w:style w:type="character" w:customStyle="1" w:styleId="Ttulo3Car">
+    <w:name w:val="Título 3 Car"/>
+    <w:basedOn w:val="Fuentedeprrafopredeter"/>
+    <w:link w:val="Ttulo3"/>
     <w:uiPriority w:val="9"/>
     <w:semiHidden/>
     <w:rsid w:val="00282BA7"/>
@@ -2079,10 +2102,10 @@
       <w:szCs w:val="28"/>
     </w:rPr>
   </w:style>
-  <w:style w:type="character" w:customStyle="1" w:styleId="Heading4Char">
-    <w:name w:val="Heading 4 Char"/>
-    <w:basedOn w:val="DefaultParagraphFont"/>
-    <w:link w:val="Heading4"/>
+  <w:style w:type="character" w:customStyle="1" w:styleId="Ttulo4Car">
+    <w:name w:val="Título 4 Car"/>
+    <w:basedOn w:val="Fuentedeprrafopredeter"/>
+    <w:link w:val="Ttulo4"/>
     <w:uiPriority w:val="9"/>
     <w:semiHidden/>
     <w:rsid w:val="00282BA7"/>
@@ -2093,10 +2116,10 @@
       <w:color w:val="2F5496" w:themeColor="accent1" w:themeShade="BF"/>
     </w:rPr>
   </w:style>
-  <w:style w:type="character" w:customStyle="1" w:styleId="Heading5Char">
-    <w:name w:val="Heading 5 Char"/>
-    <w:basedOn w:val="DefaultParagraphFont"/>
-    <w:link w:val="Heading5"/>
+  <w:style w:type="character" w:customStyle="1" w:styleId="Ttulo5Car">
+    <w:name w:val="Título 5 Car"/>
+    <w:basedOn w:val="Fuentedeprrafopredeter"/>
+    <w:link w:val="Ttulo5"/>
     <w:uiPriority w:val="9"/>
     <w:semiHidden/>
     <w:rsid w:val="00282BA7"/>
@@ -2105,10 +2128,10 @@
       <w:color w:val="2F5496" w:themeColor="accent1" w:themeShade="BF"/>
     </w:rPr>
   </w:style>
-  <w:style w:type="character" w:customStyle="1" w:styleId="Heading6Char">
-    <w:name w:val="Heading 6 Char"/>
-    <w:basedOn w:val="DefaultParagraphFont"/>
-    <w:link w:val="Heading6"/>
+  <w:style w:type="character" w:customStyle="1" w:styleId="Ttulo6Car">
+    <w:name w:val="Título 6 Car"/>
+    <w:basedOn w:val="Fuentedeprrafopredeter"/>
+    <w:link w:val="Ttulo6"/>
     <w:uiPriority w:val="9"/>
     <w:semiHidden/>
     <w:rsid w:val="00282BA7"/>
@@ -2119,10 +2142,10 @@
       <w:color w:val="595959" w:themeColor="text1" w:themeTint="A6"/>
     </w:rPr>
   </w:style>
-  <w:style w:type="character" w:customStyle="1" w:styleId="Heading7Char">
-    <w:name w:val="Heading 7 Char"/>
-    <w:basedOn w:val="DefaultParagraphFont"/>
-    <w:link w:val="Heading7"/>
+  <w:style w:type="character" w:customStyle="1" w:styleId="Ttulo7Car">
+    <w:name w:val="Título 7 Car"/>
+    <w:basedOn w:val="Fuentedeprrafopredeter"/>
+    <w:link w:val="Ttulo7"/>
     <w:uiPriority w:val="9"/>
     <w:semiHidden/>
     <w:rsid w:val="00282BA7"/>
@@ -2131,10 +2154,10 @@
       <w:color w:val="595959" w:themeColor="text1" w:themeTint="A6"/>
     </w:rPr>
   </w:style>
-  <w:style w:type="character" w:customStyle="1" w:styleId="Heading8Char">
-    <w:name w:val="Heading 8 Char"/>
-    <w:basedOn w:val="DefaultParagraphFont"/>
-    <w:link w:val="Heading8"/>
+  <w:style w:type="character" w:customStyle="1" w:styleId="Ttulo8Car">
+    <w:name w:val="Título 8 Car"/>
+    <w:basedOn w:val="Fuentedeprrafopredeter"/>
+    <w:link w:val="Ttulo8"/>
     <w:uiPriority w:val="9"/>
     <w:semiHidden/>
     <w:rsid w:val="00282BA7"/>
@@ -2145,10 +2168,10 @@
       <w:color w:val="272727" w:themeColor="text1" w:themeTint="D8"/>
     </w:rPr>
   </w:style>
-  <w:style w:type="character" w:customStyle="1" w:styleId="Heading9Char">
-    <w:name w:val="Heading 9 Char"/>
-    <w:basedOn w:val="DefaultParagraphFont"/>
-    <w:link w:val="Heading9"/>
+  <w:style w:type="character" w:customStyle="1" w:styleId="Ttulo9Car">
+    <w:name w:val="Título 9 Car"/>
+    <w:basedOn w:val="Fuentedeprrafopredeter"/>
+    <w:link w:val="Ttulo9"/>
     <w:uiPriority w:val="9"/>
     <w:semiHidden/>
     <w:rsid w:val="00282BA7"/>
@@ -2157,11 +2180,11 @@
       <w:color w:val="272727" w:themeColor="text1" w:themeTint="D8"/>
     </w:rPr>
   </w:style>
-  <w:style w:type="paragraph" w:styleId="Title">
+  <w:style w:type="paragraph" w:styleId="Ttulo">
     <w:name w:val="Title"/>
     <w:basedOn w:val="Normal"/>
     <w:next w:val="Normal"/>
-    <w:link w:val="TitleChar"/>
+    <w:link w:val="TtuloCar"/>
     <w:uiPriority w:val="10"/>
     <w:qFormat/>
     <w:rsid w:val="00282BA7"/>
@@ -2177,10 +2200,10 @@
       <w:szCs w:val="56"/>
     </w:rPr>
   </w:style>
-  <w:style w:type="character" w:customStyle="1" w:styleId="TitleChar">
-    <w:name w:val="Title Char"/>
-    <w:basedOn w:val="DefaultParagraphFont"/>
-    <w:link w:val="Title"/>
+  <w:style w:type="character" w:customStyle="1" w:styleId="TtuloCar">
+    <w:name w:val="Título Car"/>
+    <w:basedOn w:val="Fuentedeprrafopredeter"/>
+    <w:link w:val="Ttulo"/>
     <w:uiPriority w:val="10"/>
     <w:rsid w:val="00282BA7"/>
     <w:rPr>
@@ -2191,11 +2214,11 @@
       <w:szCs w:val="56"/>
     </w:rPr>
   </w:style>
-  <w:style w:type="paragraph" w:styleId="Subtitle">
+  <w:style w:type="paragraph" w:styleId="Subttulo">
     <w:name w:val="Subtitle"/>
     <w:basedOn w:val="Normal"/>
     <w:next w:val="Normal"/>
-    <w:link w:val="SubtitleChar"/>
+    <w:link w:val="SubttuloCar"/>
     <w:uiPriority w:val="11"/>
     <w:qFormat/>
     <w:rsid w:val="00282BA7"/>
@@ -2212,10 +2235,10 @@
       <w:szCs w:val="28"/>
     </w:rPr>
   </w:style>
-  <w:style w:type="character" w:customStyle="1" w:styleId="SubtitleChar">
-    <w:name w:val="Subtitle Char"/>
-    <w:basedOn w:val="DefaultParagraphFont"/>
-    <w:link w:val="Subtitle"/>
+  <w:style w:type="character" w:customStyle="1" w:styleId="SubttuloCar">
+    <w:name w:val="Subtítulo Car"/>
+    <w:basedOn w:val="Fuentedeprrafopredeter"/>
+    <w:link w:val="Subttulo"/>
     <w:uiPriority w:val="11"/>
     <w:rsid w:val="00282BA7"/>
     <w:rPr>
@@ -2226,11 +2249,11 @@
       <w:szCs w:val="28"/>
     </w:rPr>
   </w:style>
-  <w:style w:type="paragraph" w:styleId="Quote">
+  <w:style w:type="paragraph" w:styleId="Cita">
     <w:name w:val="Quote"/>
     <w:basedOn w:val="Normal"/>
     <w:next w:val="Normal"/>
-    <w:link w:val="QuoteChar"/>
+    <w:link w:val="CitaCar"/>
     <w:uiPriority w:val="29"/>
     <w:qFormat/>
     <w:rsid w:val="00282BA7"/>
@@ -2244,10 +2267,10 @@
       <w:color w:val="404040" w:themeColor="text1" w:themeTint="BF"/>
     </w:rPr>
   </w:style>
-  <w:style w:type="character" w:customStyle="1" w:styleId="QuoteChar">
-    <w:name w:val="Quote Char"/>
-    <w:basedOn w:val="DefaultParagraphFont"/>
-    <w:link w:val="Quote"/>
+  <w:style w:type="character" w:customStyle="1" w:styleId="CitaCar">
+    <w:name w:val="Cita Car"/>
+    <w:basedOn w:val="Fuentedeprrafopredeter"/>
+    <w:link w:val="Cita"/>
     <w:uiPriority w:val="29"/>
     <w:rsid w:val="00282BA7"/>
     <w:rPr>
@@ -2256,7 +2279,7 @@
       <w:color w:val="404040" w:themeColor="text1" w:themeTint="BF"/>
     </w:rPr>
   </w:style>
-  <w:style w:type="paragraph" w:styleId="ListParagraph">
+  <w:style w:type="paragraph" w:styleId="Prrafodelista">
     <w:name w:val="List Paragraph"/>
     <w:basedOn w:val="Normal"/>
     <w:uiPriority w:val="34"/>
@@ -2267,9 +2290,9 @@
       <w:contextualSpacing/>
     </w:pPr>
   </w:style>
-  <w:style w:type="character" w:styleId="IntenseEmphasis">
+  <w:style w:type="character" w:styleId="nfasisintenso">
     <w:name w:val="Intense Emphasis"/>
-    <w:basedOn w:val="DefaultParagraphFont"/>
+    <w:basedOn w:val="Fuentedeprrafopredeter"/>
     <w:uiPriority w:val="21"/>
     <w:qFormat/>
     <w:rsid w:val="00282BA7"/>
@@ -2279,11 +2302,11 @@
       <w:color w:val="2F5496" w:themeColor="accent1" w:themeShade="BF"/>
     </w:rPr>
   </w:style>
-  <w:style w:type="paragraph" w:styleId="IntenseQuote">
+  <w:style w:type="paragraph" w:styleId="Citadestacada">
     <w:name w:val="Intense Quote"/>
     <w:basedOn w:val="Normal"/>
     <w:next w:val="Normal"/>
-    <w:link w:val="IntenseQuoteChar"/>
+    <w:link w:val="CitadestacadaCar"/>
     <w:uiPriority w:val="30"/>
     <w:qFormat/>
     <w:rsid w:val="00282BA7"/>
@@ -2302,10 +2325,10 @@
       <w:color w:val="2F5496" w:themeColor="accent1" w:themeShade="BF"/>
     </w:rPr>
   </w:style>
-  <w:style w:type="character" w:customStyle="1" w:styleId="IntenseQuoteChar">
-    <w:name w:val="Intense Quote Char"/>
-    <w:basedOn w:val="DefaultParagraphFont"/>
-    <w:link w:val="IntenseQuote"/>
+  <w:style w:type="character" w:customStyle="1" w:styleId="CitadestacadaCar">
+    <w:name w:val="Cita destacada Car"/>
+    <w:basedOn w:val="Fuentedeprrafopredeter"/>
+    <w:link w:val="Citadestacada"/>
     <w:uiPriority w:val="30"/>
     <w:rsid w:val="00282BA7"/>
     <w:rPr>
@@ -2314,9 +2337,9 @@
       <w:color w:val="2F5496" w:themeColor="accent1" w:themeShade="BF"/>
     </w:rPr>
   </w:style>
-  <w:style w:type="character" w:styleId="IntenseReference">
+  <w:style w:type="character" w:styleId="Referenciaintensa">
     <w:name w:val="Intense Reference"/>
-    <w:basedOn w:val="DefaultParagraphFont"/>
+    <w:basedOn w:val="Fuentedeprrafopredeter"/>
     <w:uiPriority w:val="32"/>
     <w:qFormat/>
     <w:rsid w:val="00282BA7"/>
@@ -2328,9 +2351,9 @@
       <w:spacing w:val="5"/>
     </w:rPr>
   </w:style>
-  <w:style w:type="table" w:styleId="TableGrid">
+  <w:style w:type="table" w:styleId="Tablaconcuadrcula">
     <w:name w:val="Table Grid"/>
-    <w:basedOn w:val="TableNormal"/>
+    <w:basedOn w:val="Tablanormal"/>
     <w:uiPriority w:val="39"/>
     <w:rsid w:val="00282BA7"/>
     <w:pPr>

</xml_diff>